<commit_message>
docs: replace Aptos font with Calibri in docx theme
Aptos/Aptos Display (Office 2023+ font scheme) caused missing-font
warnings on older Word and non-Windows systems. Replaced with
Calibri Light (major/headings) and Calibri (minor/body) in theme1.xml
for universal compatibility.

Co-Authored-By: Claude Sonnet 4.6 <noreply@anthropic.com>
</commit_message>
<xml_diff>
--- a/doc/Arch_AI_Reference_Card.docx
+++ b/doc/Arch_AI_Reference_Card.docx
@@ -6111,7 +6111,7 @@
     </a:clrScheme>
     <a:fontScheme name="Office">
       <a:majorFont>
-        <a:latin typeface="Aptos Display" panose="02110004020202020204"/>
+        <a:latin typeface="Calibri Light" panose="02110004020202020204"/>
         <a:ea typeface=""/>
         <a:cs typeface=""/>
         <a:font script="Jpan" typeface="游ゴシック Light"/>
@@ -6163,7 +6163,7 @@
         <a:font script="Tfng" typeface="Ebrima"/>
       </a:majorFont>
       <a:minorFont>
-        <a:latin typeface="Aptos" panose="02110004020202020204"/>
+        <a:latin typeface="Calibri" panose="02110004020202020204"/>
         <a:ea typeface=""/>
         <a:cs typeface=""/>
         <a:font script="Jpan" typeface="游明朝"/>

</xml_diff>